<commit_message>
[Docs] 삭제된 OWASP_Top10_2025_한글요약 참조 제거
이전 커밋에서 브랜치별 중복 문서(OWASP_Top10_2025_한글요약.md/.docx)를
삭제하면서 남은 참조를 정리한다. 괄호 안 OWASP 번호 설명 등 고유 정보는
유지하고 더 이상 존재하지 않는 파일명 인용만 제거했다.
</commit_message>
<xml_diff>
--- a/docs/security/09_Security_Misconfiguration.docx
+++ b/docs/security/09_Security_Misconfiguration.docx
@@ -27,7 +27,7 @@
           <w:iCs/>
           <w:color w:val="595959"/>
         </w:rPr>
-        <w:t xml:space="preserve">OWASP Top 10 2025 #2 보안 설정 오류(Security Misconfiguration) — 2021년 #5에서 #2로 순위가 올라간 항목(OWASP_Top10_2025_한글요약 참고)</w:t>
+        <w:t xml:space="preserve">OWASP Top 10 2025 #2 보안 설정 오류(Security Misconfiguration) — 2021년 #5에서 #2로 순위가 올라간 항목</w:t>
       </w:r>
     </w:p>
     <w:p>
@@ -2230,7 +2230,7 @@
         <w:spacing w:after="60" w:line="260" w:lineRule="auto"/>
       </w:pPr>
       <w:r>
-        <w:t xml:space="preserve">개념: OWASP_Top10_2025_한글요약 (#2 보안 설정 오류 — 2021년 #5에서 #2로 순위 상승)</w:t>
+        <w:t xml:space="preserve">OWASP Top 10 2025 #2 보안 설정 오류 — 2021년 #5에서 #2로 순위 상승</w:t>
       </w:r>
     </w:p>
     <w:p>

</xml_diff>

<commit_message>
[문서] 09_Security_Misconfiguration.docx에 Micrometer 집계 추가 설명 보강
4-4절 신설: SecurityAuditListener에 MeterRegistry 로 auth.events
카운터(success/failure)를 추가한 코드와, 기존 ROLE_ADMIN 가드를
그대로 적용받는 이유, 실측 결과(success=2, failure=2)를 반영
</commit_message>
<xml_diff>
--- a/docs/security/09_Security_Misconfiguration.docx
+++ b/docs/security/09_Security_Misconfiguration.docx
@@ -1925,6 +1925,105 @@
         </w:tc>
       </w:tr>
     </w:tbl>
+    <w:p>
+      <w:pPr>
+        <w:pStyle w:val="Heading2"/>
+        <w:spacing w:after="100" w:before="240"/>
+      </w:pPr>
+      <w:r>
+        <w:rPr>
+          <w:b/>
+          <w:bCs/>
+          <w:color w:val="2E5496"/>
+        </w:rPr>
+        <w:t xml:space="preserve">4-4. 안전하게 기능 확장하기 — Micrometer 집계 추가</w:t>
+      </w:r>
+    </w:p>
+    <w:p>
+      <w:pPr>
+        <w:spacing w:after="90" w:line="272" w:lineRule="auto"/>
+      </w:pPr>
+      <w:r>
+        <w:t xml:space="preserve">노출 범위를 최소화한다고 해서 운영에 필요한 기능까지 포기할 필요는 없다. SecurityAuditListener 에 MeterRegistry 를 주입해, 로그인 성공/실패 이벤트를 auth.events 카운터(result=success|failure)로 집계하도록 확장했다.</w:t>
+      </w:r>
+    </w:p>
+    <w:p>
+      <w:pPr>
+        <w:pBdr>
+          <w:top w:val="single" w:color="BFBFBF" w:sz="2"/>
+          <w:left w:val="single" w:color="BFBFBF" w:sz="2"/>
+          <w:bottom w:val="single" w:color="BFBFBF" w:sz="2"/>
+          <w:right w:val="single" w:color="BFBFBF" w:sz="2"/>
+        </w:pBdr>
+        <w:shd w:fill="F2F2F2" w:val="clear"/>
+        <w:spacing w:after="160" w:before="60"/>
+      </w:pPr>
+      <w:r>
+        <w:rPr>
+          <w:rFonts w:ascii="Consolas" w:cs="Consolas" w:eastAsia="Consolas" w:hAnsi="Consolas"/>
+          <w:sz w:val="18"/>
+          <w:szCs w:val="18"/>
+        </w:rPr>
+        <w:t xml:space="preserve">private final MeterRegistry meterRegistry;</w:t>
+      </w:r>
+      <w:r>
+        <w:br/>
+        <w:t xml:space="preserve"/>
+      </w:r>
+      <w:r>
+        <w:rPr>
+          <w:rFonts w:ascii="Consolas" w:cs="Consolas" w:eastAsia="Consolas" w:hAnsi="Consolas"/>
+          <w:sz w:val="18"/>
+          <w:szCs w:val="18"/>
+        </w:rPr>
+        <w:t xml:space="preserve"/>
+      </w:r>
+      <w:r>
+        <w:br/>
+        <w:t xml:space="preserve"/>
+      </w:r>
+      <w:r>
+        <w:rPr>
+          <w:rFonts w:ascii="Consolas" w:cs="Consolas" w:eastAsia="Consolas" w:hAnsi="Consolas"/>
+          <w:sz w:val="18"/>
+          <w:szCs w:val="18"/>
+        </w:rPr>
+        <w:t xml:space="preserve">meterRegistry.counter("auth.events", "result", "success").increment();</w:t>
+      </w:r>
+      <w:r>
+        <w:br/>
+        <w:t xml:space="preserve"/>
+      </w:r>
+      <w:r>
+        <w:rPr>
+          <w:rFonts w:ascii="Consolas" w:cs="Consolas" w:eastAsia="Consolas" w:hAnsi="Consolas"/>
+          <w:sz w:val="18"/>
+          <w:szCs w:val="18"/>
+        </w:rPr>
+        <w:t xml:space="preserve">meterRegistry.counter("auth.events", "result", "failure").increment();</w:t>
+      </w:r>
+    </w:p>
+    <w:p>
+      <w:pPr>
+        <w:spacing w:after="90" w:line="272" w:lineRule="auto"/>
+      </w:pPr>
+      <w:r>
+        <w:t xml:space="preserve">핵심은 새로 생기는 조회 경로(/actuator/metrics/auth.events)가 4-2에서 추가한 .requestMatchers("/actuator/**").hasAuthority("ROLE_ADMIN") 규칙을 그대로 적용받는다는 것이다 — SecurityConfig 는 전혀 건드리지 않았다. 기본 노출 범위(health,info)도 그대로 둔 채, 집계값을 실제로 보려면 ACTUATOR_EXPOSURE=health,info,metrics 로 의도적으로 넓혀야 한다.</w:t>
+      </w:r>
+    </w:p>
+    <w:p>
+      <w:pPr>
+        <w:spacing w:after="90" w:line="272" w:lineRule="auto"/>
+      </w:pPr>
+      <w:r>
+        <w:rPr>
+          <w:i/>
+          <w:iCs/>
+          <w:color w:val="595959"/>
+        </w:rPr>
+        <w:t xml:space="preserve">실측(2026-10-14): REST·폼 로그인으로 성공 2건·실패 2건을 발생시킨 뒤 관리자 세션으로 /actuator/metrics/auth.events 를 조회 — result=success → 2, result=failure → 2. 세션 없이 조회하면 302(로그인 페이지로 리다이렉트)로 차단되는 것도 함께 확인했다.</w:t>
+      </w:r>
+    </w:p>
     <w:p>
       <w:pPr>
         <w:pStyle w:val="Heading1"/>

</xml_diff>

<commit_message>
09_Security_Misconfiguration.docx 포맷을 이전 브랜치(08) 기준으로 통일
- 표지 페이지 추가 (제목/부제/OWASP 분류/실습 프로젝트)
- 목차 페이지 추가 (1~6 대제목 불릿 리스트)
- 페이지 번호 헤더 추가 (word/header1.xml + 관계/Content_Types 등록)
- 기존 본문 내용은 변경 없이 유지
</commit_message>
<xml_diff>
--- a/docs/security/09_Security_Misconfiguration.docx
+++ b/docs/security/09_Security_Misconfiguration.docx
@@ -2,6 +2,164 @@
 <file path=word/document.xml><?xml version="1.0" encoding="utf-8"?>
 <w:document xmlns:wpc="http://schemas.microsoft.com/office/word/2010/wordprocessingCanvas" xmlns:mc="http://schemas.openxmlformats.org/markup-compatibility/2006" xmlns:o="urn:schemas-microsoft-com:office:office" xmlns:r="http://schemas.openxmlformats.org/officeDocument/2006/relationships" xmlns:m="http://schemas.openxmlformats.org/officeDocument/2006/math" xmlns:v="urn:schemas-microsoft-com:vml" xmlns:wp14="http://schemas.microsoft.com/office/word/2010/wordprocessingDrawing" xmlns:wp="http://schemas.openxmlformats.org/drawingml/2006/wordprocessingDrawing" xmlns:w10="urn:schemas-microsoft-com:office:word" xmlns:w="http://schemas.openxmlformats.org/wordprocessingml/2006/main" xmlns:w14="http://schemas.microsoft.com/office/word/2010/wordml" xmlns:w15="http://schemas.microsoft.com/office/word/2012/wordml" xmlns:wpg="http://schemas.microsoft.com/office/word/2010/wordprocessingGroup" xmlns:wpi="http://schemas.microsoft.com/office/word/2010/wordprocessingInk" xmlns:wne="http://schemas.microsoft.com/office/word/2006/wordml" xmlns:wps="http://schemas.microsoft.com/office/word/2010/wordprocessingShape" xmlns:cx="http://schemas.microsoft.com/office/drawing/2014/chartex" xmlns:cx1="http://schemas.microsoft.com/office/drawing/2015/9/8/chartex" xmlns:cx2="http://schemas.microsoft.com/office/drawing/2015/10/21/chartex" xmlns:cx3="http://schemas.microsoft.com/office/drawing/2016/5/9/chartex" xmlns:cx4="http://schemas.microsoft.com/office/drawing/2016/5/10/chartex" xmlns:cx5="http://schemas.microsoft.com/office/drawing/2016/5/11/chartex" xmlns:cx6="http://schemas.microsoft.com/office/drawing/2016/5/12/chartex" xmlns:cx7="http://schemas.microsoft.com/office/drawing/2016/5/13/chartex" xmlns:cx8="http://schemas.microsoft.com/office/drawing/2016/5/14/chartex" xmlns:aink="http://schemas.microsoft.com/office/drawing/2016/ink" xmlns:am3d="http://schemas.microsoft.com/office/drawing/2017/model3d" xmlns:w16cex="http://schemas.microsoft.com/office/word/2018/wordml/cex" xmlns:w16cid="http://schemas.microsoft.com/office/word/2016/wordml/cid" xmlns:w16="http://schemas.microsoft.com/office/word/2018/wordml" xmlns:w16sdtdh="http://schemas.microsoft.com/office/word/2020/wordml/sdtdatahash" xmlns:w16se="http://schemas.microsoft.com/office/word/2015/wordml/symex" mc:Ignorable="w14 w15 wp14">
   <w:body>
+    <w:p>
+      <w:pPr>
+        <w:spacing w:before="1100" w:after="200"/>
+        <w:jc w:val="center"/>
+      </w:pPr>
+      <w:r>
+        <w:rPr>
+          <w:b/>
+          <w:bCs/>
+          <w:color w:val="1F3864"/>
+          <w:sz w:val="30"/>
+          <w:szCs w:val="30"/>
+        </w:rPr>
+        <w:t xml:space="preserve">웹 보안 실습 교안</w:t>
+      </w:r>
+    </w:p>
+    <w:p>
+      <w:pPr>
+        <w:spacing w:after="120"/>
+        <w:jc w:val="center"/>
+      </w:pPr>
+      <w:r>
+        <w:rPr>
+          <w:b/>
+          <w:bCs/>
+          <w:color w:val="1F3864"/>
+          <w:sz w:val="40"/>
+          <w:szCs w:val="40"/>
+        </w:rPr>
+        <w:t xml:space="preserve">보안 설정 오류 (Security Misconfiguration)</w:t>
+      </w:r>
+    </w:p>
+    <w:p>
+      <w:pPr>
+        <w:spacing w:after="500"/>
+        <w:jc w:val="center"/>
+      </w:pPr>
+      <w:r>
+        <w:rPr>
+          <w:color w:val="595959"/>
+        </w:rPr>
+        <w:t xml:space="preserve">Security Misconfiguration / OWASP #2(보안 설정 오류)</w:t>
+      </w:r>
+    </w:p>
+    <w:p>
+      <w:pPr>
+        <w:spacing w:after="60"/>
+        <w:jc w:val="center"/>
+      </w:pPr>
+      <w:r>
+        <w:rPr>
+          <w:color w:val="595959"/>
+        </w:rPr>
+        <w:t xml:space="preserve">실습 프로젝트 : Student_JWT (feature/security-misconfig-demo)</w:t>
+      </w:r>
+    </w:p>
+    <w:p>
+      <w:r>
+        <w:br w:type="page"/>
+      </w:r>
+    </w:p>
+    <w:p>
+      <w:pPr>
+        <w:pStyle w:val="Heading1"/>
+        <w:spacing w:before="320" w:after="160"/>
+      </w:pPr>
+      <w:r>
+        <w:rPr>
+          <w:b/>
+          <w:bCs/>
+          <w:color w:val="1F3864"/>
+        </w:rPr>
+        <w:t xml:space="preserve">목차</w:t>
+      </w:r>
+    </w:p>
+    <w:p>
+      <w:pPr>
+        <w:pStyle w:val="ListParagraph"/>
+        <w:numPr>
+          <w:ilvl w:val="0"/>
+          <w:numId w:val="1"/>
+        </w:numPr>
+        <w:spacing w:after="50" w:line="264" w:lineRule="auto"/>
+      </w:pPr>
+      <w:r>
+        <w:t xml:space="preserve">1. 개념 요약</w:t>
+      </w:r>
+    </w:p>
+    <w:p>
+      <w:pPr>
+        <w:pStyle w:val="ListParagraph"/>
+        <w:numPr>
+          <w:ilvl w:val="0"/>
+          <w:numId w:val="1"/>
+        </w:numPr>
+        <w:spacing w:after="50" w:line="264" w:lineRule="auto"/>
+      </w:pPr>
+      <w:r>
+        <w:t xml:space="preserve">2. 변경 내역 — 1단계(취약) → 2단계(조치)</w:t>
+      </w:r>
+    </w:p>
+    <w:p>
+      <w:pPr>
+        <w:pStyle w:val="ListParagraph"/>
+        <w:numPr>
+          <w:ilvl w:val="0"/>
+          <w:numId w:val="1"/>
+        </w:numPr>
+        <w:spacing w:after="50" w:line="264" w:lineRule="auto"/>
+      </w:pPr>
+      <w:r>
+        <w:t xml:space="preserve">3. 공격 실습 (검증됨 — 2026-10-05)</w:t>
+      </w:r>
+    </w:p>
+    <w:p>
+      <w:pPr>
+        <w:pStyle w:val="ListParagraph"/>
+        <w:numPr>
+          <w:ilvl w:val="0"/>
+          <w:numId w:val="1"/>
+        </w:numPr>
+        <w:spacing w:after="50" w:line="264" w:lineRule="auto"/>
+      </w:pPr>
+      <w:r>
+        <w:t xml:space="preserve">4. 방어 원리</w:t>
+      </w:r>
+    </w:p>
+    <w:p>
+      <w:pPr>
+        <w:pStyle w:val="ListParagraph"/>
+        <w:numPr>
+          <w:ilvl w:val="0"/>
+          <w:numId w:val="1"/>
+        </w:numPr>
+        <w:spacing w:after="50" w:line="264" w:lineRule="auto"/>
+      </w:pPr>
+      <w:r>
+        <w:t xml:space="preserve">5. 방어 정리</w:t>
+      </w:r>
+    </w:p>
+    <w:p>
+      <w:pPr>
+        <w:pStyle w:val="ListParagraph"/>
+        <w:numPr>
+          <w:ilvl w:val="0"/>
+          <w:numId w:val="1"/>
+        </w:numPr>
+        <w:spacing w:after="50" w:line="264" w:lineRule="auto"/>
+      </w:pPr>
+      <w:r>
+        <w:t xml:space="preserve">6. 관련 문서</w:t>
+      </w:r>
+    </w:p>
+    <w:p>
+      <w:r>
+        <w:br w:type="page"/>
+      </w:r>
+    </w:p>
     <w:p>
       <w:pPr>
         <w:spacing w:after="200"/>
@@ -2359,6 +2517,7 @@
       </w:r>
     </w:p>
     <w:sectPr>
+      <w:headerReference w:type="default" r:id="rId8"/>
       <w:pgSz w:w="11906" w:h="16838" w:orient="portrait"/>
       <w:pgMar w:top="1440" w:right="1440" w:bottom="1440" w:left="1440" w:header="708" w:footer="708" w:gutter="0"/>
       <w:pgNumType/>
@@ -2440,6 +2599,34 @@
     </w:p>
   </w:footnote>
 </w:footnotes>
+</file>
+
+<file path=word/header1.xml><?xml version="1.0" encoding="utf-8"?>
+<w:hdr xmlns:wpc="http://schemas.microsoft.com/office/word/2010/wordprocessingCanvas" xmlns:cx="http://schemas.microsoft.com/office/drawing/2014/chartex" xmlns:mc="http://schemas.openxmlformats.org/markup-compatibility/2006" xmlns:o="urn:schemas-microsoft-com:office:office" xmlns:r="http://schemas.openxmlformats.org/officeDocument/2006/relationships" xmlns:m="http://schemas.openxmlformats.org/officeDocument/2006/math" xmlns:v="urn:schemas-microsoft-com:vml" xmlns:wp14="http://schemas.microsoft.com/office/word/2010/wordprocessingDrawing" xmlns:wp="http://schemas.openxmlformats.org/drawingml/2006/wordprocessingDrawing" xmlns:w10="urn:schemas-microsoft-com:office:word" xmlns:w="http://schemas.openxmlformats.org/wordprocessingml/2006/main" xmlns:w14="http://schemas.microsoft.com/office/word/2010/wordml" xmlns:w15="http://schemas.microsoft.com/office/word/2012/wordml" xmlns:wpg="http://schemas.microsoft.com/office/word/2010/wordprocessingGroup" xmlns:wpi="http://schemas.microsoft.com/office/word/2010/wordprocessingInk" xmlns:wne="http://schemas.microsoft.com/office/word/2006/wordml" xmlns:wps="http://schemas.microsoft.com/office/word/2010/wordprocessingShape" mc:Ignorable="w14 w15 wp14">
+  <w:p>
+    <w:pPr>
+      <w:jc w:val="right"/>
+    </w:pPr>
+    <w:r>
+      <w:fldChar w:fldCharType="begin"/>
+    </w:r>
+    <w:r>
+      <w:instrText xml:space="preserve"> PAGE   \* MERGEFORMAT </w:instrText>
+    </w:r>
+    <w:r>
+      <w:fldChar w:fldCharType="separate"/>
+    </w:r>
+    <w:r>
+      <w:rPr>
+        <w:noProof/>
+      </w:rPr>
+      <w:t>1</w:t>
+    </w:r>
+    <w:r>
+      <w:fldChar w:fldCharType="end"/>
+    </w:r>
+  </w:p>
+</w:hdr>
 </file>
 
 <file path=word/numbering.xml><?xml version="1.0" encoding="utf-8"?>

</xml_diff>